<commit_message>
La limitacion de idioma se quedaba corta: 35 + 4, y 3 no verificables
El error 10 del plan del 2026-10-07 seguia sin corregir. La limitacion de
los tres manuscritos atribuia a la restriccion de idioma 35 estudios: son
35 en el cribado de resumenes y 4 mas al leer el texto completo, y otros 3
salieron porque su idioma no pudo verificarse. Cifras desde escalares y
anclada. El resumen ("eliminó 35 estudios más", aparte de los 118) ya era
correcto y no se toca.

Co-Authored-By: Claude Opus 5.5 <noreply@anthropic.com>
</commit_message>
<xml_diff>
--- a/paper/docx/informe_extendido.docx
+++ b/paper/docx/informe_extendido.docx
@@ -133,7 +133,7 @@
           <w:i w:val="0"/>
           <w:sz w:val="22"/>
         </w:rPr>
-        <w:t xml:space="preserve"> resumen 295; texto principal 10 372.</w:t>
+        <w:t xml:space="preserve"> resumen 295; texto principal 10 394.</w:t>
       </w:r>
     </w:p>
     <w:p>
@@ -6662,7 +6662,7 @@
           <w:i w:val="0"/>
           <w:sz w:val="22"/>
         </w:rPr>
-        <w:t xml:space="preserve"> la restricción a inglés y español se adoptó con el cribado ya terminado y eliminó 35 estudios, 18 de ellos comparativos y uno del conjunto de control positivo; empuja el corpus en la misma dirección que el sesgo de recuperación y reduce lo que esta revisión puede decir sobre la literatura de Europa del Este. </w:t>
+        <w:t xml:space="preserve"> la restricción a inglés y español se adoptó con el cribado ya terminado y eliminó 35 estudios en el cribado de resúmenes, 18 de ellos comparativos y uno del conjunto de control positivo, y 4 más al leer el texto completo; otros 3 salieron porque su idioma no pudo verificarse; empuja el corpus en la misma dirección que el sesgo de recuperación y reduce lo que esta revisión puede decir sobre la literatura de Europa del Este. </w:t>
       </w:r>
       <w:r>
         <w:rPr>

</xml_diff>

<commit_message>
Firmas de N. Trelles que el registro no respalda, corregidas
Segunda ronda del consejo, comprobada contra los ficheros y el historial:
- 27 exclusiones del 1 y 2-sep figuraban firmadas por los dos y solo
  consta la orden de D.V.: el CSV lo dice ahora (89 / 2 / 27, anclado).
- 2 descartes de solapamiento del modelo sin firma (28 de 30 firmados).
- La declaracion de IA, Metodos, CRediT y protocolo dicen quien decidio
  cada criterio, que el modelo redacto las ecuaciones y los mensajes a
  N.T. en primera persona de D.V.
- S0 y S16 renombrados; anclas de la relectura y recuentos al dia
  (400/400); canal regenerado, los cinco guardianes en verde.
- Registro de decision 2026-10-15 y nota en firma_nataly.

Queda de N.T.: ratificar o no las 27 exclusiones y los 2 descartes, y
saber que el mensaje del 1-sep lo redacto el modelo.

Co-Authored-By: Claude Opus 5.5 <noreply@anthropic.com>
</commit_message>
<xml_diff>
--- a/paper/docx/informe_extendido.docx
+++ b/paper/docx/informe_extendido.docx
@@ -133,7 +133,7 @@
           <w:i w:val="0"/>
           <w:sz w:val="22"/>
         </w:rPr>
-        <w:t xml:space="preserve"> resumen 295; texto principal 10 394.</w:t>
+        <w:t xml:space="preserve"> resumen 295; texto principal 10 490.</w:t>
       </w:r>
     </w:p>
     <w:p>
@@ -1066,7 +1066,7 @@
           <w:i w:val="0"/>
           <w:sz w:val="22"/>
         </w:rPr>
-        <w:t>Según declara D.V. (8 de octubre de 2026), diseñó las ecuaciones con la participación del modelo de lenguaje cuya intervención se declara en la sección 2.4 y las ejecutó en cada interfaz con la guía del modelo; los mensajes de los commits del 3 de agosto de 2026, que redactó el modelo, narran esa ejecución en primera persona. Los registros de PubMed y de ClinicalTrials.gov que entraron al corpus se descargaron por API con guiones escritos por el modelo, y los recuentos de ClinicalTrials.gov se cuadraron con los de la interfaz. Las ecuaciones se aportan íntegras como suplemento, con la sintaxis literal de cada interfaz y el número de resultados, de modo que cualquiera puede repetirlas. BVS y SciELO se incluyeron para no inclinar la revisión hacia la literatura anglosajona, y aportaron 2 de los 233 informes que llegaron a texto completo: cubren Iberoamérica, y de los 24 estudios que declaran procedencia, 9 son de Rusia, Polonia, Georgia o Ucrania.</w:t>
+        <w:t>Las ecuaciones de cada plataforma y sus reglas de diseño las redactó el modelo de lenguaje cuya intervención se declara en la sección 2.4 (3 de agosto de 2026). Según declara D.V. (8 de octubre de 2026), las ejecutó en cada interfaz con la guía del modelo; los mensajes de los commits del 3 de agosto de 2026, que redactó el modelo, narran esa ejecución en primera persona. Los registros de PubMed y de ClinicalTrials.gov que entraron al corpus se descargaron por API con guiones escritos por el modelo, y los recuentos de ClinicalTrials.gov se cuadraron con los de la interfaz. Las ecuaciones se aportan íntegras como suplemento, con la sintaxis literal de cada interfaz y el número de resultados, de modo que cualquiera puede repetirlas. BVS y SciELO se incluyeron para no inclinar la revisión hacia la literatura anglosajona, y aportaron 2 de los 233 informes que llegaron a texto completo: cubren Iberoamérica, y de los 24 estudios que declaran procedencia, 9 son de Rusia, Polonia, Georgia o Ucrania.</w:t>
       </w:r>
     </w:p>
     <w:p>
@@ -1266,7 +1266,7 @@
           <w:i w:val="0"/>
           <w:sz w:val="22"/>
         </w:rPr>
-        <w:t>: 13 917 decisiones de título y 460 de resumen. D.V. fue el único revisor humano. Según declara (8 de octubre de 2026), examinó uno a uno los informes que superaron el cribado, pero ese examen no quedó registrado. La agrupación de esos informes en estudios la propuso un guion escrito por el modelo, y se aporta íntegra (S5). Los registros que el modelo excluyó no los releyó ningún humano, salvo la muestra de la sección 2.5. Cada decisión quedó registrada con su motivo y su marca de tiempo en un registro solo-anexar que se aporta íntegro (S3).</w:t>
+        <w:t>: 13 917 decisiones de título y 460 de resumen. D.V. fue el único revisor humano. Según declara (8 de octubre de 2026), examinó uno a uno los informes que superaron el cribado, pero ese examen no quedó registrado. La agrupación de esos informes en estudios la propuso un guion escrito por el modelo, y se aporta íntegra (S5). Los registros que el modelo excluyó no los releyó ningún humano, salvo la muestra de la sección 2.5. Cada decisión del cribado vigente quedó registrada con su motivo y su marca de tiempo en un registro solo-anexar que se aporta íntegro (S3); la primera pasada del 4 de agosto sobre el brazo A de PubMed, que el cribado del pozo sustituyó, consta en el repositorio y no en S3.</w:t>
       </w:r>
     </w:p>
     <w:p>
@@ -1362,7 +1362,7 @@
           <w:i w:val="0"/>
           <w:sz w:val="22"/>
         </w:rPr>
-        <w:t>. Una corrección es una fila nueva que sustituye a la anterior; ambas permanecen. Esta revisión tuvo que corregir una exclusión errónea, y esa corrección solo es auditable porque la fila original sobrevivió.</w:t>
+        <w:t>. Una corrección es una fila nueva que sustituye a la anterior; ambas permanecen. Esta revisión tuvo que corregir una exclusión errónea, y esa corrección solo es auditable porque la fila original sobrevivió; está en el registro de esa primera pasada, en el repositorio, y no en S3.</w:t>
       </w:r>
     </w:p>
     <w:p>
@@ -1518,7 +1518,7 @@
           <w:i w:val="0"/>
           <w:sz w:val="22"/>
         </w:rPr>
-        <w:t xml:space="preserve"> Tres preguntas no se podían contestar con el formulario y se respondieron volviendo al artículo, con un cuaderno por pregunta en el que cada conclusión lleva la frase o la tabla en que se apoya y la firma de los dos autores, fechada el 30 de septiembre de 2026: la clase de resistencia de los 70 estudios que entonces tenían texto completo, comprobada contra el antibiograma publicado (sección 3.4, anexo S23); el comparador, el tiempo cero, el tiempo de evaluación, las cointervenciones, las pérdidas y el estimando de los 14 estudios con diseño comparativo, 11 de ellos con texto (sección 3.7, anexo S24), y los pares de estudios que podían describir a los mismos pacientes (sección 4.4, anexo S21). La relectura la hicieron los dos autores, que leyeron cada uno los artículos completos y comprobaron contra la figura los antibiogramas que el artículo solo da en imagen; además, cada frase citada se buscó de forma automática en el texto de su PDF. Las correcciones que la relectura deja inequívocas entran en la extracción como correcciones firmadas, con el valor anterior y la cita; las que dejaban un brazo con más de un valor, y las exclusiones que la relectura puso de manifiesto, las decidieron y firmaron los dos autores el 1 y el 3 de octubre de 2026.</w:t>
+        <w:t xml:space="preserve"> Tres preguntas no se podían contestar con el formulario y se respondieron volviendo al artículo, con un cuaderno por pregunta en el que cada conclusión lleva la frase o la tabla en que se apoya y la firma de los dos autores, fechada el 30 de septiembre de 2026: la clase de resistencia de los 70 estudios que entonces tenían texto completo, comprobada contra el antibiograma publicado (sección 3.4, anexo S23); el comparador, el tiempo cero, el tiempo de evaluación, las cointervenciones, las pérdidas y el estimando de los 14 estudios con diseño comparativo, 11 de ellos con texto (sección 3.7, anexo S24), y los pares de estudios que podían describir a los mismos pacientes (sección 4.4, anexo S21). La relectura la hicieron los dos autores, que leyeron cada uno los artículos completos y comprobaron contra la figura los antibiogramas que el artículo solo da en imagen; además, cada frase citada se buscó de forma automática en el texto de su PDF. Las correcciones que la relectura deja inequívocas entran en la extracción con el valor que el modelo derivó de la conclusión firmada, el valor anterior y la cita; las que dejaban un brazo con más de un valor, y las exclusiones que la relectura puso de manifiesto, las decidieron y firmaron los dos autores el 1 y el 3 de octubre de 2026.</w:t>
       </w:r>
     </w:p>
     <w:p>
@@ -2300,7 +2300,7 @@
           <w:i w:val="0"/>
           <w:sz w:val="22"/>
         </w:rPr>
-        <w:t xml:space="preserve"> Se excluyeron por ocho motivos, y ninguno es una discrepancia de criterio: son estudios que no cumplen lo que la sección 2.2 ya exigía. </w:t>
+        <w:t xml:space="preserve"> Se excluyeron por ocho motivos, y ninguno es una discrepancia de criterio: en siete, el estudio no cumple lo que la sección 2.2 ya exigía; los NOREC salieron porque no pudo verificarse. </w:t>
       </w:r>
       <w:r>
         <w:rPr>
@@ -3738,7 +3738,7 @@
           <w:i w:val="0"/>
           <w:sz w:val="22"/>
         </w:rPr>
-        <w:t xml:space="preserve"> tratada. De los 30 comprobados, la clase coincidió con la codificada en 18; en 5 la extracción la daba por no clasificable y el artículo permitía asignarla —3 por debajo del umbral y 2 XDR—; en 2 era más grave que la codificada (EST-043 y EST-047); en 3 la clase declarada no se confirmó (EST-015, EST-030 y EST-042), y en 2 cambia entre pacientes o entre aislados del mismo brazo (EST-124 y EST-169). Las 35 correcciones que la lectura deja inequívocas para el brazo entero —8 de clase, 17 de su procedencia y 10 del criterio DTR— entraron en la extracción con la firma de los dos autores. Los 9 estudios en que dejaba un brazo con más de un valor los resolvieron los dos autores el 1 de octubre de 2026: en 5 se corrigió la extracción (EST-047, EST-048, EST-058, EST-106 y EST-124) y en 4 se dejó como estaba (EST-004, EST-019, EST-042 y EST-169). Dos de esos cuatro se declaran expresamente: EST-042 conserva la PDR que declaran sus autores aunque su propio antibiograma no la sostiene, y EST-169 mantiene en un mismo brazo un paciente por debajo del umbral y otro XDR.</w:t>
+        <w:t xml:space="preserve"> tratada. De los 30 comprobados, la clase coincidió con la codificada en 18; en 5 la extracción la daba por no clasificable y el artículo permitía asignarla —3 por debajo del umbral y 2 XDR—; en 2 era más grave que la codificada (EST-043 y EST-047); en 3 la clase declarada no se confirmó (EST-015, EST-030 y EST-042), y en 2 cambia entre pacientes o entre aislados del mismo brazo (EST-124 y EST-169). Las 35 correcciones que la lectura deja inequívocas para el brazo entero —8 de clase, 17 de su procedencia y 10 del criterio DTR— entraron en la extracción con el valor que el modelo derivó del texto que firmaron los dos autores. Los 9 estudios en que dejaba un brazo con más de un valor los resolvieron los dos autores el 1 de octubre de 2026: en 5 se corrigió la extracción (EST-047, EST-048, EST-058, EST-106 y EST-124) y en 4 se dejó como estaba (EST-004, EST-019, EST-042 y EST-169). Dos de esos cuatro se declaran expresamente: EST-042 conserva la PDR que declaran sus autores aunque su propio antibiograma no la sostiene, y EST-169 mantiene en un mismo brazo un paciente por debajo del umbral y otro XDR.</w:t>
       </w:r>
     </w:p>
     <w:p>
@@ -6734,7 +6734,7 @@
           <w:i w:val="0"/>
           <w:sz w:val="22"/>
         </w:rPr>
-        <w:t>; el veredicto de cada par lleva la frase en que se apoya y la firma de los dos autores (anexo S21). Como la revisión no publica ninguna estimación agrupada, la duplicación no altera ninguna cifra de efecto, pero impide leer el corpus como 65 conjuntos disjuntos de pacientes.</w:t>
+        <w:t>; 28 de los 30 veredictos llevan la frase en que se apoyan y la firma de los dos autores (anexo S21); los otros 2, descartes que hizo la lectura del modelo del 22 de septiembre de 2026, no constan firmados. Como la revisión no publica ninguna estimación agrupada, la duplicación no altera ninguna cifra de efecto, pero impide leer el corpus como 65 conjuntos disjuntos de pacientes.</w:t>
       </w:r>
     </w:p>
     <w:p>
@@ -6904,7 +6904,7 @@
           <w:i w:val="0"/>
           <w:sz w:val="22"/>
         </w:rPr>
-        <w:t xml:space="preserve"> conceptualización, metodología, investigación (según declara D.V., diseño de las búsquedas con la participación del modelo de lenguaje y su ejecución en cada interfaz con la guía del modelo; extracción de datos; riesgo de sesgo), dirección del software, la curación de datos, el análisis y la visualización, que programó y ejecutó el modelo de lenguaje, revisión de los borradores, que redactó el modelo, y administración del proyecto. </w:t>
+        <w:t xml:space="preserve"> conceptualización, metodología, investigación (según declara D.V., ejecución de las búsquedas en cada interfaz con la guía del modelo de lenguaje, que redactó las ecuaciones; extracción de datos; riesgo de sesgo), dirección del software, la curación de datos, el análisis y la visualización, que programó y ejecutó el modelo de lenguaje, revisión de los borradores, que redactó el modelo, y administración del proyecto. </w:t>
       </w:r>
       <w:r>
         <w:rPr>
@@ -6986,7 +6986,7 @@
           <w:i w:val="0"/>
           <w:sz w:val="22"/>
         </w:rPr>
-        <w:t xml:space="preserve"> Redactó las propuestas de criterios y de reglas que decidieron los autores: entre ellas, la unidad de inclusión por estudio y la elegibilidad de los resúmenes de congreso (5 de agosto de 2026), los códigos de exclusión añadidos después del cribado (PRO, INT y NOORG) y las reglas de desenlace, que según declara D.V. decidieron los dos autores, aunque el registro del 12 de agosto de 2026 las dejó como propuesta sin ratificar; y las dos reglas añadidas a mitad de lote el 4 de agosto, que incorporó a sus guiones de cribado. </w:t>
+        <w:t xml:space="preserve"> Redactó las propuestas de criterios que se adoptaron: la unidad de inclusión por estudio y la elegibilidad de los resúmenes de congreso (5 de agosto de 2026), que decidió D.V.; los códigos PRO e INT (1 de septiembre de 2026), por orden de D.V.; el código NOORG (14 de septiembre de 2026), que firmaron los dos autores; y las reglas de desenlace, que según declara D.V. decidieron los dos autores, aunque el registro del 12 de agosto de 2026 las dejó como propuesta sin ratificar. El criterio de idioma, que se adoptó a petición del equipo, y los de texto completo (NOREC y NOPDF), que pidió D.V., no los propuso el modelo. El 4 de agosto añadió además a mitad de lote, en sus guiones de cribado, dos reglas que concretan los criterios, sin que conste una decisión de los autores. </w:t>
       </w:r>
       <w:r>
         <w:rPr>
@@ -7022,7 +7022,7 @@
           <w:i w:val="0"/>
           <w:sz w:val="22"/>
         </w:rPr>
-        <w:t xml:space="preserve"> Participó en el diseño de las ecuaciones, que según declara D.V. ejecutó D.V. en cada interfaz con la guía del modelo; redactó los mensajes de los commits del 3 de agosto de 2026, que narran esa ejecución en primera persona, y descargó por API los registros de PubMed y ClinicalTrials.gov. </w:t>
+        <w:t xml:space="preserve"> Redactó las ecuaciones de cada plataforma y sus reglas de diseño (3 de agosto de 2026), que según declara D.V. ejecutó D.V. en cada interfaz con la guía del modelo; redactó los mensajes de los commits del 3 de agosto de 2026, que narran esa ejecución en primera persona, y descargó por API los registros de PubMed y ClinicalTrials.gov. </w:t>
       </w:r>
       <w:r>
         <w:rPr>
@@ -7040,7 +7040,7 @@
           <w:i w:val="0"/>
           <w:sz w:val="22"/>
         </w:rPr>
-        <w:t xml:space="preserve"> Localizó y descargó textos completos, también con un navegador; propuso la agrupación de los informes en estudios; leyó los textos completos y las fichas de registro y propuso, con su cita, las exclusiones que se apoyan en ellos, que firmaron los dos autores salvo dos que firmó D.V. solo; generó, unió y comparó los cuadernos de extracción; propuso con su cita una resolución para parte de los desacuerdos de una comparación posteriormente rehecha; extrajo las casillas del tercer paciente de EST-121, que firmó solo D.V., y propuso correcciones de modalidad que firmaron los dos; tradujo a categorías las conclusiones firmadas de la relectura y aplicó las que dejaban un valor único; y detectó y leyó primero los pares de estudios que podían compartir pacientes, antes de la relectura de los autores. </w:t>
+        <w:t xml:space="preserve"> Localizó y descargó textos completos, también con un navegador; propuso la agrupación de los informes en estudios; leyó los textos completos y las fichas de registro y propuso, con su cita, las exclusiones que se apoyan en ellos; de las 118 exclusiones a texto completo, 89 las firmaron los dos autores, 2 las firmó D.V. solo y 27 se registraron por orden de D.V. del 1 y el 2 de septiembre de 2026 sin que conste la firma de N.T.; generó, unió y comparó los cuadernos de extracción; propuso con su cita una resolución para parte de los desacuerdos de una comparación posteriormente rehecha; extrajo las casillas del tercer paciente de EST-121, que firmó solo D.V., y propuso correcciones de modalidad que firmaron los dos; tradujo a categorías las conclusiones firmadas de la relectura y aplicó las que dejaban un valor único; detectó y leyó primero los pares de estudios que podían compartir pacientes, antes de la relectura de los autores, y descartó 2 de ellos sin que los autores firmaran ese descarte; y redactó, en primera persona de D.V., las instrucciones y los mensajes dirigidos a N.T., entre ellos el que pidió su firma para las correcciones de modalidad, que presentaba como lectura de D.V. la que había hecho el modelo. </w:t>
       </w:r>
       <w:r>
         <w:rPr>

</xml_diff>